<commit_message>
Auto commit (2026-10-14 19:17) — 11 changes
Claude Code 세션 종료 시 자동 커밋.

Co-Authored-By: Claude <noreply@anthropic.com>
Claude-Session: https://claude.ai/code/43ac1272-2ac2-486b-81c0-c80b6d631d14
</commit_message>
<xml_diff>
--- a/projects/41_fated_reunion/The Little Girl Who Hired Her Own Dad_작가 proposal.docx
+++ b/projects/41_fated_reunion/The Little Girl Who Hired Her Own Dad_작가 proposal.docx
@@ -258,7 +258,7 @@
           <w:b w:val="0"/>
           <w:sz w:val="20"/>
         </w:rPr>
-        <w:t>· 돈 주고 아빠를 고용한 딸. 고용된 아빠만 친딸인 줄 모름</w:t>
+        <w:t>· 돈 주고 아빠를 고용한 딸. 그 아빠가 진짜 아빠인 줄은 아빠도 엄마도 모름</w:t>
       </w:r>
     </w:p>
     <w:p>
@@ -310,7 +310,7 @@
           <w:b w:val="0"/>
           <w:sz w:val="20"/>
         </w:rPr>
-        <w:t>· 바꾼 것 하나: 다섯 살 딸이 모은 동전 열두 닢으로 왕세자를 아빠로 고용</w:t>
+        <w:t>· 핵심으로 바꾼 것: 다섯 살 딸이 모은 동전 열두 닢으로 왕세자를 아빠로 고용</w:t>
       </w:r>
     </w:p>
     <w:p>
@@ -323,7 +323,7 @@
           <w:b w:val="0"/>
           <w:sz w:val="20"/>
         </w:rPr>
-        <w:t>· 그 밖에 아들 대신 딸, 사람 왕가 대신 엘프 왕가, 천식 대신 왕세자와 같은 열병, 성화 대신 엘프 왕가의 피만 안 태우는 신전의 불</w:t>
+        <w:t>· 같이 바꾼 설정: 아들 대신 딸, 사람 왕가 대신 엘프 왕가, 천식 대신 왕세자와 같은 열병, 성화 대신 엘프 왕가의 피만 안 태우는 신전의 불</w:t>
       </w:r>
     </w:p>
     <w:p>
@@ -466,7 +466,7 @@
           <w:b w:val="0"/>
           <w:sz w:val="20"/>
         </w:rPr>
-        <w:t>· 원작 40~45화: 가짜 왕자에게 반지 안쪽 흠집 수를 물어 함정을 파는 장면</w:t>
+        <w:t>· 원작 44~45화: 자기 행세를 하는 가짜 왕자에게 반지 안쪽 흠집 수를 물어 함정을 파는 장면</w:t>
       </w:r>
     </w:p>
     <w:p>
@@ -518,7 +518,7 @@
           <w:b w:val="0"/>
           <w:sz w:val="20"/>
         </w:rPr>
-        <w:t>· 고수위 장면 진입 직전 컷을 지문에 따로 구성. 광고는 이 컷에서 끊고, 시청자는 이 컷만 보고도 다음이 야한 장면임을 짐작 (예: 정사 직전 놀라는 얼굴, 정사를 목격하고 굳는 얼굴)</w:t>
+        <w:t>· 고수위 장면 진입 직전 컷을 지문에 따로 구성. 광고는 이 컷에서 끊고, 시청자는 이 컷만 보고도 다음이 야한 장면임을 짐작 (예: 1화 마차 안 하룻밤 직전, 세바스찬이 엘라를 끌어당기는 순간)</w:t>
       </w:r>
     </w:p>
     <w:p>
@@ -596,7 +596,7 @@
           <w:b w:val="0"/>
           <w:sz w:val="20"/>
         </w:rPr>
-        <w:t>날이 밝자 남자는 마차와 함께 사라지고, 엘라 손에는 엘프 왕가 문장이 새겨진 반지 하나만 남는다. 6년 뒤, 엘라는 항구 어시장에서 생선을 팔고, 그 곁에는 다섯 살 딸 릴리가 있다. 릴리는 그 반지를 목에 걸고, 손님들 생선 비늘을 긁어 주고 받은 동전을 한 닢씩 모은다. 「어시장에선 돈만 있으면 다 살 수 있어. 그러니까 아빠도 살 거야.」 동전이 열두 닢이 된 날, 엘라를 찾아낸 오빠가 노름빚을 갚아야 한다며 릴리의 약값을 빼앗는다. 엘라가 그 돈이 없으면 릴리가 죽는다고 매달리자, 오빠는 사생아 하나 죽는 게 대수냐며 숨이 넘어가는 릴리에게 몽둥이를 치켜든다. 「멈춰!」</w:t>
+        <w:t>날이 밝자 남자는 마차와 함께 사라지고, 엘라 손에는 그 남자가 끼고 있던 반지 하나만 남는다. 6년 뒤, 엘라는 항구 어시장에서 생선을 팔고, 그 곁에는 다섯 살 딸 릴리가 있다. 릴리는 그 반지를 목에 걸고, 손님들 생선 비늘을 긁어 주고 받은 동전을 한 닢씩 모은다. 「어시장에선 돈만 있으면 다 살 수 있어. 그러니까 아빠도 살 거야.」 동전이 열두 닢이 된 날, 엘라를 찾아낸 오빠가 노름빚을 갚아야 한다며 릴리의 약값을 빼앗는다. 엘라가 그 돈이 없으면 릴리가 죽는다고 매달리자, 오빠는 사생아 하나 죽는 게 대수냐며 숨이 넘어가는 릴리에게 몽둥이를 치켜든다. 「멈춰!」</w:t>
       </w:r>
     </w:p>
     <w:p>
@@ -622,7 +622,7 @@
           <w:b w:val="0"/>
           <w:sz w:val="20"/>
         </w:rPr>
-        <w:t>몽둥이를 붙잡은 사람은 세바스찬이다. 세바스찬은 릴리가 자기와 똑같은 열병을 앓는 걸 알아보고, 늘 지니던 약을 한 방울 릴리 입에 떨어뜨린다. 숨이 돌아온 릴리는 세바스찬을 아빠라고 부르며 안긴다. 세바스찬이 이 아이는 내 딸이라고 둘러대자, 그제야 왕세자를 알아본 오빠는 무릎을 꿇었다가 달아난다. 그때 호위가, 결혼하라는 국왕에게 숨겨 둔 자식이 있다고 해 놨으니 다음 보름달 연회까지 그 아이를 못 데려가면 왕세자 자리가 형에게 넘어간다고 귀띔한다. 옆에서 그 말을 들은 릴리는 아빠 살 돈이라며 동전 열두 닢을 세바스찬 손에 쥐여 주고, 엄마한테 잘해 주는 것도 조건이라고 한다. 세바스찬은 제 딸에게 고용되는 줄도 모르고 동전을 받아 쥔다. 「좋아. 다음 보름달까지, 내가 네 아빠다.」</w:t>
+        <w:t>몽둥이를 붙잡은 사람은 세바스찬이다. 세바스찬은 릴리가 자기와 똑같은 열병을 앓는 걸 알아보고, 늘 지니던 약을 한 방울 릴리 입에 떨어뜨린다. 숨이 돌아온 릴리는 세바스찬을 아빠라고 부르며 안긴다. 세바스찬이 이 아이는 내 딸이라고 둘러대자, 그제야 왕세자를 알아본 오빠는 무릎을 꿇었다가 달아난다. 그때 호위가 세바스찬에게, 결혼하라는 국왕에게 숨겨 둔 자식이 있다고 둘러대 놓았으니 다음 보름달 연회까지 그 아이를 못 데려가면 왕세자 자리가 형에게 넘어간다고 귀띔한다. 옆에서 그 말을 들은 릴리는 아빠 살 돈이라며 동전 열두 닢을 세바스찬 손에 쥐여 주고, 엄마한테 잘해 주는 것도 조건이라고 한다. 세바스찬은 제 딸에게 고용되는 줄도 모르고 동전을 받아 쥔다. 「좋아. 다음 보름달까지, 내가 네 아빠다.」</w:t>
       </w:r>
     </w:p>
     <w:p>
@@ -700,7 +700,7 @@
           <w:b w:val="0"/>
           <w:sz w:val="20"/>
         </w:rPr>
-        <w:t>세바스찬은 웃음을 참으며 가슴 주머니에서 동전 열두 닢을 꺼내 보고, 한 닢도 쓰지 않은 채 다시 넣는다. 다음 날 국왕은 두 손녀를 보물 창고로 데려가 마음에 드는 걸 하나씩 고르라고 한다. 나탈리의 딸은 보석 왕관과 목걸이를 잔뜩 걸친다. 릴리는 국왕이 오래 덮던 낡은 망토를 고르고, 할아버지가 보고 싶을 때마다 덮겠다고 한다. 국왕이 그 망토를 릴리 어깨에 직접 걸어 주자, 나탈리는 비린내 나는 애라 보석 볼 줄도 모른다며 비웃는다. 그런데 형의 얼굴은 하얗게 굳는다. 형이 나탈리 귀에 대고 말한다. 「웃지 마. 저건 다음 왕의 손주한테만 걸어 주는 망토야.」</w:t>
+        <w:t>세바스찬은 웃음을 참으며 가슴 주머니에서 동전 열두 닢을 꺼내 보고, 한 닢도 쓰지 않은 채 다시 넣는다. 다음 날 국왕은 두 손녀를 보물 창고로 데려가 마음에 드는 걸 하나씩 고르라고 한다. 나탈리의 딸은 보석 왕관과 목걸이를 잔뜩 걸친다. 릴리는 국왕이 오래 덮던 낡은 망토를 고르고, 할아버지가 보고 싶을 때마다 덮겠다고 한다. 국왕이 그 망토를 릴리 어깨에 직접 걸어 주자, 나탈리는 비린내 나는 애라 보석 볼 줄도 모른다며 비웃는다. 그런데 형의 얼굴은 하얗게 굳는다. 형이 나탈리 귀에 대고 말한다. 「웃지 마. 저건 다음 왕이 될 손주한테만 걸어 주는 망토야.」</w:t>
       </w:r>
     </w:p>
     <w:p>
@@ -726,7 +726,7 @@
           <w:b w:val="0"/>
           <w:sz w:val="20"/>
         </w:rPr>
-        <w:t>그날 밤 나탈리는 친정아버지에게 편지를 보내, 윈터 가문에 엘라라는 딸이 정말 있는지 알아봐 달라고 한다. 형은 보름달 연회에 신전의 불을 들이자고 국왕을 조른다. 그 불은 엘프 왕가의 피는 태우지 않고, 다른 엘프는 뼈까지 태운다. 연회 날 밤, 문 앞에서 엘라가 떨자 릴리는 사장님 명령이라며 세바스찬에게 엄마 손을 잡으라고 시킨다. 세바스찬이 손을 잡는 순간 엘라는 걸음을 멈춘다. 6년 전 마차 안에서 자기를 끌어당기던 그 남자의 손과 똑같다. 하지만 엘라는 왕세자가 그 밤 숲길에 있었을 리 없다며 고개를 젓고, 세바스찬도 손을 잡은 이 여자가 그 밤의 여자인 줄 모른다. 그때 나탈리 손에 친정아버지의 답장이 들어온다.</w:t>
+        <w:t>그날 밤 나탈리는 친정아버지에게 편지를 보내, 윈터 가문에 엘라라는 딸이 정말 있는지 알아봐 달라고 한다. 형은 보름달 연회에 신전의 불을 들이자고 국왕을 조른다. 그 불은 엘프 왕가의 피는 태우지 않고, 다른 엘프는 뼈까지 태운다. 연회 날 밤, 문 앞에서 엘라가 떨자 릴리는 자기가 사장님이라며 세바스찬에게 엄마 손을 잡으라고 시킨다. 세바스찬이 손을 잡는 순간 엘라는 걸음을 멈춘다. 6년 전 마차 안에서 자기를 끌어당기던 그 남자의 손과 똑같다. 하지만 엘라는 왕세자가 그 밤 숲길에 있었을 리 없다며 고개를 젓고, 세바스찬도 손을 잡은 이 여자가 그 밤의 여자인 줄 모른다. 그때 나탈리 손에 친정아버지의 답장이 들어온다.</w:t>
       </w:r>
     </w:p>
     <w:p>
@@ -752,7 +752,7 @@
           <w:b w:val="0"/>
           <w:sz w:val="20"/>
         </w:rPr>
-        <w:t>나탈리가 답장을 소매 속에 감추는 사이, 국왕은 이웃 나라 사절을 맞으러 나가며 릴리에게 엄마랑 먼저 먹으라고 한다. 늘 생선 머리만 먹던 엘라와 릴리는 연회장 바닥에 앉아 어시장에서처럼 고기를 손으로 뜯는다. 귀족들이 비린내 나는 것들이 개처럼 먹는다며 웃자, 엘라는 엄마가 못나서 그렇다며 릴리를 끌어안는다. 뒤늦게 들어온 세바스찬은 그 옆 바닥에 앉아 릴리 입에 고기를 넣어 준다. 「내 가족을 비웃는 놈은 나를 비웃는 거다.」 나탈리가 왕세자가 바닥에서 먹는다고 소리치자, 마침 돌아온 국왕마저 바닥에 앉으며 전쟁터에선 다 이렇게 먹었다고 호통친다. 귀족들이 하나둘 바닥에 앉아 왕세자 만세를 외치고, 그 함성 속에서 나탈리는 답장을 움켜쥔다.</w:t>
+        <w:t>나탈리가 답장을 소매 속에 감추는 사이, 국왕은 이웃 나라 사절을 맞으러 나가며 릴리에게 엄마랑 먼저 먹으라고 한다. 늘 생선 머리만 먹던 엘라와 릴리는 연회장 바닥에 앉아 어시장에서처럼 고기를 손으로 뜯는다. 귀족들이 비린내 나는 것들이 개처럼 먹는다며 웃자, 엘라는 엄마가 못나서 그렇다며 릴리를 끌어안는다. 릴리가 고기를 쥔 채 엄마를 올려다본다. 「엄마 잘못 아니야.」 뒤늦게 들어온 세바스찬은 그 옆 바닥에 앉아 릴리 입에 고기를 넣어 준다. 「내 가족을 비웃는 놈은 나를 비웃는 거다.」 나탈리가 왕세자가 바닥에서 먹는다고 소리치자, 마침 돌아온 국왕마저 바닥에 앉으며 전쟁터에선 다 이렇게 먹었다고 호통친다. 귀족들이 하나둘 바닥에 앉아 왕세자 만세를 외치고, 그 함성 속에서 나탈리는 답장을 움켜쥔다.</w:t>
       </w:r>
     </w:p>
     <w:p>

</xml_diff>

<commit_message>
Auto commit (2026-10-14 19:18) — 4 changes
Claude Code 세션 종료 시 자동 커밋.

Co-Authored-By: Claude <noreply@anthropic.com>
</commit_message>
<xml_diff>
--- a/projects/41_fated_reunion/The Little Girl Who Hired Her Own Dad_작가 proposal.docx
+++ b/projects/41_fated_reunion/The Little Girl Who Hired Her Own Dad_작가 proposal.docx
@@ -258,7 +258,7 @@
           <w:b w:val="0"/>
           <w:sz w:val="20"/>
         </w:rPr>
-        <w:t>· 돈 주고 아빠를 고용한 딸. 그 아빠가 진짜 아빠인 줄은 아빠도 엄마도 모름</w:t>
+        <w:t>· 돈 주고 아빠를 고용한 딸. 고용된 남자가 진짜 아빠라는 걸 본인도 엄마도 모름</w:t>
       </w:r>
     </w:p>
     <w:p>
@@ -622,7 +622,7 @@
           <w:b w:val="0"/>
           <w:sz w:val="20"/>
         </w:rPr>
-        <w:t>몽둥이를 붙잡은 사람은 세바스찬이다. 세바스찬은 릴리가 자기와 똑같은 열병을 앓는 걸 알아보고, 늘 지니던 약을 한 방울 릴리 입에 떨어뜨린다. 숨이 돌아온 릴리는 세바스찬을 아빠라고 부르며 안긴다. 세바스찬이 이 아이는 내 딸이라고 둘러대자, 그제야 왕세자를 알아본 오빠는 무릎을 꿇었다가 달아난다. 그때 호위가 세바스찬에게, 결혼하라는 국왕에게 숨겨 둔 자식이 있다고 둘러대 놓았으니 다음 보름달 연회까지 그 아이를 못 데려가면 왕세자 자리가 형에게 넘어간다고 귀띔한다. 옆에서 그 말을 들은 릴리는 아빠 살 돈이라며 동전 열두 닢을 세바스찬 손에 쥐여 주고, 엄마한테 잘해 주는 것도 조건이라고 한다. 세바스찬은 제 딸에게 고용되는 줄도 모르고 동전을 받아 쥔다. 「좋아. 다음 보름달까지, 내가 네 아빠다.」</w:t>
+        <w:t>몽둥이를 붙잡은 사람은 세바스찬이다. 세바스찬은 릴리가 자기와 똑같은 열병을 앓는 걸 알아보고, 늘 지니던 약을 한 방울 릴리 입에 떨어뜨린다. 숨이 돌아온 릴리는 세바스찬을 아빠라고 부르며 안긴다. 세바스찬이 이 아이는 내 딸이라고 둘러대자, 그제야 왕세자를 알아본 오빠는 무릎을 꿇었다가 달아난다. 그때 호위가 세바스찬에게 귀띔한다. 세바스찬이 결혼하라고 조르는 국왕에게 숨겨 둔 자식이 있다고 둘러댔으니, 다음 보름달 연회까지 그 아이를 못 데려가면 왕세자 자리가 형에게 넘어간다. 옆에서 그 말을 들은 릴리는 아빠 살 돈이라며 동전 열두 닢을 세바스찬 손에 쥐여 주고, 엄마한테 잘해 주는 것도 조건이라고 한다. 세바스찬은 제 딸에게 고용되는 줄도 모르고 동전을 받아 쥔다. 「좋아. 다음 보름달까지, 내가 네 아빠다.」</w:t>
       </w:r>
     </w:p>
     <w:p>

</xml_diff>

<commit_message>
Auto commit (2026-10-16 10:07) — 11 changes
Claude Code 세션 종료 시 자동 커밋.

Co-Authored-By: Claude <noreply@anthropic.com>
Claude-Session: https://claude.ai/code/01ff7141-4325-41c8-8957-0eef3aa7c961
</commit_message>
<xml_diff>
--- a/projects/41_fated_reunion/The Little Girl Who Hired Her Own Dad_작가 proposal.docx
+++ b/projects/41_fated_reunion/The Little Girl Who Hired Her Own Dad_작가 proposal.docx
@@ -674,7 +674,7 @@
           <w:b w:val="0"/>
           <w:sz w:val="20"/>
         </w:rPr>
-        <w:t>그 말에 세바스찬은 릴리를 내려다본다. 돈 주고 자기를 고용한 아이가 자기 어릴 적 얼굴을 하고 있다. 형이 닮은 애를 잘도 골라 왔다고 코웃음 치자, 릴리는 국왕 품에 안긴 채 할아버지 코도 자기랑 똑같은데 할아버지도 아빠가 골라 온 거냐고 받아친다. 국왕이 크게 웃으며 엘라에게 어느 가문의 딸이냐고 묻자, 세바스찬은 바다 건너 윈터 가문이라고 둘러댄다. 나탈리는 처음 듣는 이름인데도 그 집 딸을 안다고 큰소리친다. 그날 밤 세바스찬이 릴리의 진짜 아빠는 어디 있냐고 묻자, 엘라는 집에 안 돌아오는 떠돌이 사냥꾼이라고 지어낸다. 세바스찬이 그놈을 찾으면 다리를 분질러 놓겠다고 하자, 옆에서 듣던 릴리가 거든다. 「꼭이요. 두 다리 다요.」</w:t>
+        <w:t>그 말에 세바스찬은 릴리를 내려다본다. 돈 주고 자기를 고용한 아이가 자기 어릴 적 얼굴을 하고 있다. 형이 닮은 애를 잘도 골라 왔다고 코웃음 치자, 릴리는 국왕 품에 안긴 채 할아버지 코도 자기랑 똑같은데 할아버지도 아빠가 골라 온 거냐고 받아친다. 국왕이 크게 웃으며 엘라에게 어느 가문의 딸이냐고 묻자, 세바스찬은 바다 건너 윈터 가문이라고 둘러댄다. 나탈리는 윈터 가문이면 바다 건너 최고 명문인데 그 집에 이런 딸이 있다는 말은 들어 본 적이 없다며 엘라를 위아래로 훑어본다. 그날 밤 세바스찬이 릴리의 진짜 아빠는 어디 있냐고 묻자, 엘라는 집에 안 돌아오는 떠돌이 사냥꾼이라고 지어낸다. 세바스찬이 그놈을 찾으면 다리를 분질러 놓겠다고 하자, 옆에서 듣던 릴리가 거든다. 「꼭이요. 두 다리 다요.」</w:t>
       </w:r>
     </w:p>
     <w:p>
@@ -792,6 +792,19 @@
           <w:sz w:val="24"/>
         </w:rPr>
         <w:t>첨부</w:t>
+      </w:r>
+    </w:p>
+    <w:p>
+      <w:pPr>
+        <w:spacing w:after="60" w:before="0"/>
+      </w:pPr>
+      <w:r>
+        <w:rPr>
+          <w:rFonts w:ascii="Malgun Gothic" w:hAnsi="Malgun Gothic" w:eastAsia="Malgun Gothic"/>
+          <w:b w:val="0"/>
+          <w:sz w:val="20"/>
+        </w:rPr>
+        <w:t>· 전체 회차 트리트먼트(1~50화) — The Little Girl Who Hired Her Own Dad_회차 트리트먼트_1-50화.docx</w:t>
       </w:r>
     </w:p>
     <w:p>

</xml_diff>